<commit_message>
Updated proposal with data analytics and dashboard
</commit_message>
<xml_diff>
--- a/docs/version-control-report.docx
+++ b/docs/version-control-report.docx
@@ -13,8 +13,6 @@
           <w:szCs w:val="36"/>
         </w:rPr>
       </w:pPr>
-      <w:bookmarkStart w:id="0" w:name="_GoBack"/>
-      <w:bookmarkEnd w:id="0"/>
       <w:proofErr w:type="spellStart"/>
       <w:r>
         <w:rPr>
@@ -1260,7 +1258,35 @@
           <w:sz w:val="24"/>
           <w:szCs w:val="24"/>
         </w:rPr>
-        <w:t xml:space="preserve">Maryam Suleiman </w:t>
+        <w:t xml:space="preserve">Maryam </w:t>
+      </w:r>
+      <w:proofErr w:type="spellStart"/>
+      <w:r>
+        <w:rPr>
+          <w:rFonts w:ascii="Times New Roman" w:eastAsia="Times New Roman" w:hAnsi="Times New Roman" w:cs="Times New Roman"/>
+          <w:sz w:val="24"/>
+          <w:szCs w:val="24"/>
+        </w:rPr>
+        <w:t>Sule</w:t>
+      </w:r>
+      <w:bookmarkStart w:id="0" w:name="_GoBack"/>
+      <w:bookmarkEnd w:id="0"/>
+      <w:r>
+        <w:rPr>
+          <w:rFonts w:ascii="Times New Roman" w:eastAsia="Times New Roman" w:hAnsi="Times New Roman" w:cs="Times New Roman"/>
+          <w:sz w:val="24"/>
+          <w:szCs w:val="24"/>
+        </w:rPr>
+        <w:t>man</w:t>
+      </w:r>
+      <w:proofErr w:type="spellEnd"/>
+      <w:r>
+        <w:rPr>
+          <w:rFonts w:ascii="Times New Roman" w:eastAsia="Times New Roman" w:hAnsi="Times New Roman" w:cs="Times New Roman"/>
+          <w:sz w:val="24"/>
+          <w:szCs w:val="24"/>
+        </w:rPr>
+        <w:t xml:space="preserve"> </w:t>
       </w:r>
     </w:p>
     <w:p>

</xml_diff>

<commit_message>
Updated version control history table for M2–M5
</commit_message>
<xml_diff>
--- a/docs/version-control-report.docx
+++ b/docs/version-control-report.docx
@@ -1269,8 +1269,6 @@
         </w:rPr>
         <w:t>Sule</w:t>
       </w:r>
-      <w:bookmarkStart w:id="0" w:name="_GoBack"/>
-      <w:bookmarkEnd w:id="0"/>
       <w:r>
         <w:rPr>
           <w:rFonts w:ascii="Times New Roman" w:eastAsia="Times New Roman" w:hAnsi="Times New Roman" w:cs="Times New Roman"/>
@@ -1461,25 +1459,27 @@
     </w:p>
     <w:tbl>
       <w:tblPr>
-        <w:tblStyle w:val="GridTable4-Accent5"/>
-        <w:tblW w:w="0" w:type="auto"/>
+        <w:tblStyle w:val="GridTable4-Accent1"/>
+        <w:tblW w:w="10721" w:type="dxa"/>
         <w:tblLook w:val="04A0" w:firstRow="1" w:lastRow="0" w:firstColumn="1" w:lastColumn="0" w:noHBand="0" w:noVBand="1"/>
       </w:tblPr>
       <w:tblGrid>
-        <w:gridCol w:w="1016"/>
-        <w:gridCol w:w="1696"/>
-        <w:gridCol w:w="4663"/>
-        <w:gridCol w:w="1530"/>
-        <w:gridCol w:w="1885"/>
+        <w:gridCol w:w="1336"/>
+        <w:gridCol w:w="1809"/>
+        <w:gridCol w:w="4770"/>
+        <w:gridCol w:w="1358"/>
+        <w:gridCol w:w="1448"/>
       </w:tblGrid>
       <w:tr>
         <w:trPr>
           <w:cnfStyle w:val="100000000000" w:firstRow="1" w:lastRow="0" w:firstColumn="0" w:lastColumn="0" w:oddVBand="0" w:evenVBand="0" w:oddHBand="0" w:evenHBand="0" w:firstRowFirstColumn="0" w:firstRowLastColumn="0" w:lastRowFirstColumn="0" w:lastRowLastColumn="0"/>
+          <w:trHeight w:val="22"/>
         </w:trPr>
         <w:tc>
           <w:tcPr>
             <w:cnfStyle w:val="001000000000" w:firstRow="0" w:lastRow="0" w:firstColumn="1" w:lastColumn="0" w:oddVBand="0" w:evenVBand="0" w:oddHBand="0" w:evenHBand="0" w:firstRowFirstColumn="0" w:firstRowLastColumn="0" w:lastRowFirstColumn="0" w:lastRowLastColumn="0"/>
-            <w:tcW w:w="1016" w:type="dxa"/>
+            <w:tcW w:w="1336" w:type="dxa"/>
+            <w:vAlign w:val="center"/>
             <w:hideMark/>
           </w:tcPr>
           <w:p>
@@ -1487,16 +1487,18 @@
               <w:spacing w:after="0" w:line="240" w:lineRule="auto"/>
               <w:jc w:val="center"/>
               <w:rPr>
-                <w:rFonts w:ascii="Times New Roman" w:eastAsia="Times New Roman" w:hAnsi="Times New Roman" w:cs="Times New Roman"/>
-                <w:sz w:val="24"/>
-                <w:szCs w:val="24"/>
+                <w:rFonts w:asciiTheme="majorBidi" w:eastAsia="Times New Roman" w:hAnsiTheme="majorBidi" w:cstheme="majorBidi"/>
+                <w:sz w:val="32"/>
+                <w:szCs w:val="32"/>
               </w:rPr>
             </w:pPr>
             <w:r>
               <w:rPr>
-                <w:rFonts w:ascii="Times New Roman" w:eastAsia="Times New Roman" w:hAnsi="Times New Roman" w:cs="Times New Roman"/>
-                <w:sz w:val="24"/>
-                <w:szCs w:val="24"/>
+                <w:rFonts w:asciiTheme="majorBidi" w:hAnsiTheme="majorBidi" w:cstheme="majorBidi"/>
+                <w:b w:val="0"/>
+                <w:bCs w:val="0"/>
+                <w:sz w:val="32"/>
+                <w:szCs w:val="32"/>
               </w:rPr>
               <w:t>Version</w:t>
             </w:r>
@@ -1504,25 +1506,38 @@
         </w:tc>
         <w:tc>
           <w:tcPr>
-            <w:tcW w:w="1696" w:type="dxa"/>
+            <w:tcW w:w="1809" w:type="dxa"/>
+            <w:vAlign w:val="center"/>
             <w:hideMark/>
           </w:tcPr>
           <w:p>
             <w:pPr>
-              <w:spacing w:after="0" w:line="240" w:lineRule="auto"/>
-              <w:jc w:val="center"/>
               <w:cnfStyle w:val="100000000000" w:firstRow="1" w:lastRow="0" w:firstColumn="0" w:lastColumn="0" w:oddVBand="0" w:evenVBand="0" w:oddHBand="0" w:evenHBand="0" w:firstRowFirstColumn="0" w:firstRowLastColumn="0" w:lastRowFirstColumn="0" w:lastRowLastColumn="0"/>
               <w:rPr>
-                <w:rFonts w:ascii="Times New Roman" w:eastAsia="Times New Roman" w:hAnsi="Times New Roman" w:cs="Times New Roman"/>
-                <w:sz w:val="24"/>
-                <w:szCs w:val="24"/>
+                <w:rFonts w:asciiTheme="majorBidi" w:hAnsiTheme="majorBidi" w:cstheme="majorBidi"/>
+                <w:b w:val="0"/>
+                <w:bCs w:val="0"/>
+                <w:sz w:val="32"/>
+                <w:szCs w:val="32"/>
               </w:rPr>
             </w:pPr>
             <w:r>
               <w:rPr>
-                <w:rFonts w:ascii="Times New Roman" w:eastAsia="Times New Roman" w:hAnsi="Times New Roman" w:cs="Times New Roman"/>
-                <w:sz w:val="24"/>
-                <w:szCs w:val="24"/>
+                <w:rFonts w:asciiTheme="majorBidi" w:hAnsiTheme="majorBidi" w:cstheme="majorBidi"/>
+                <w:b w:val="0"/>
+                <w:bCs w:val="0"/>
+                <w:sz w:val="32"/>
+                <w:szCs w:val="32"/>
+              </w:rPr>
+              <w:t xml:space="preserve"> </w:t>
+            </w:r>
+            <w:r>
+              <w:rPr>
+                <w:rFonts w:asciiTheme="majorBidi" w:hAnsiTheme="majorBidi" w:cstheme="majorBidi"/>
+                <w:b w:val="0"/>
+                <w:bCs w:val="0"/>
+                <w:sz w:val="32"/>
+                <w:szCs w:val="32"/>
               </w:rPr>
               <w:t>Milestone</w:t>
             </w:r>
@@ -1530,28 +1545,28 @@
         </w:tc>
         <w:tc>
           <w:tcPr>
-            <w:tcW w:w="4663" w:type="dxa"/>
+            <w:tcW w:w="4770" w:type="dxa"/>
+            <w:vAlign w:val="center"/>
+            <w:hideMark/>
           </w:tcPr>
           <w:p>
             <w:pPr>
-              <w:spacing w:after="0" w:line="240" w:lineRule="auto"/>
-              <w:jc w:val="center"/>
               <w:cnfStyle w:val="100000000000" w:firstRow="1" w:lastRow="0" w:firstColumn="0" w:lastColumn="0" w:oddVBand="0" w:evenVBand="0" w:oddHBand="0" w:evenHBand="0" w:firstRowFirstColumn="0" w:firstRowLastColumn="0" w:lastRowFirstColumn="0" w:lastRowLastColumn="0"/>
               <w:rPr>
-                <w:rFonts w:ascii="Times New Roman" w:eastAsia="Times New Roman" w:hAnsi="Times New Roman" w:cs="Times New Roman"/>
+                <w:rFonts w:asciiTheme="majorBidi" w:hAnsiTheme="majorBidi" w:cstheme="majorBidi"/>
                 <w:b w:val="0"/>
                 <w:bCs w:val="0"/>
-                <w:sz w:val="24"/>
-                <w:szCs w:val="24"/>
+                <w:sz w:val="32"/>
+                <w:szCs w:val="32"/>
               </w:rPr>
             </w:pPr>
             <w:r>
               <w:rPr>
-                <w:rFonts w:ascii="Times New Roman" w:eastAsia="Times New Roman" w:hAnsi="Times New Roman" w:cs="Times New Roman"/>
+                <w:rFonts w:asciiTheme="majorBidi" w:hAnsiTheme="majorBidi" w:cstheme="majorBidi"/>
                 <w:b w:val="0"/>
                 <w:bCs w:val="0"/>
-                <w:sz w:val="24"/>
-                <w:szCs w:val="24"/>
+                <w:sz w:val="32"/>
+                <w:szCs w:val="32"/>
               </w:rPr>
               <w:t>Description</w:t>
             </w:r>
@@ -1559,25 +1574,29 @@
         </w:tc>
         <w:tc>
           <w:tcPr>
-            <w:tcW w:w="1530" w:type="dxa"/>
+            <w:tcW w:w="1358" w:type="dxa"/>
+            <w:vAlign w:val="center"/>
             <w:hideMark/>
           </w:tcPr>
           <w:p>
             <w:pPr>
-              <w:spacing w:after="0" w:line="240" w:lineRule="auto"/>
               <w:jc w:val="center"/>
               <w:cnfStyle w:val="100000000000" w:firstRow="1" w:lastRow="0" w:firstColumn="0" w:lastColumn="0" w:oddVBand="0" w:evenVBand="0" w:oddHBand="0" w:evenHBand="0" w:firstRowFirstColumn="0" w:firstRowLastColumn="0" w:lastRowFirstColumn="0" w:lastRowLastColumn="0"/>
               <w:rPr>
-                <w:rFonts w:ascii="Times New Roman" w:eastAsia="Times New Roman" w:hAnsi="Times New Roman" w:cs="Times New Roman"/>
-                <w:sz w:val="24"/>
-                <w:szCs w:val="24"/>
+                <w:rFonts w:asciiTheme="majorBidi" w:hAnsiTheme="majorBidi" w:cstheme="majorBidi"/>
+                <w:b w:val="0"/>
+                <w:bCs w:val="0"/>
+                <w:sz w:val="32"/>
+                <w:szCs w:val="32"/>
               </w:rPr>
             </w:pPr>
             <w:r>
               <w:rPr>
-                <w:rFonts w:ascii="Times New Roman" w:eastAsia="Times New Roman" w:hAnsi="Times New Roman" w:cs="Times New Roman"/>
-                <w:sz w:val="24"/>
-                <w:szCs w:val="24"/>
+                <w:rFonts w:asciiTheme="majorBidi" w:hAnsiTheme="majorBidi" w:cstheme="majorBidi"/>
+                <w:b w:val="0"/>
+                <w:bCs w:val="0"/>
+                <w:sz w:val="32"/>
+                <w:szCs w:val="32"/>
               </w:rPr>
               <w:t>Date</w:t>
             </w:r>
@@ -1585,25 +1604,29 @@
         </w:tc>
         <w:tc>
           <w:tcPr>
-            <w:tcW w:w="1885" w:type="dxa"/>
+            <w:tcW w:w="0" w:type="auto"/>
+            <w:vAlign w:val="center"/>
             <w:hideMark/>
           </w:tcPr>
           <w:p>
             <w:pPr>
-              <w:spacing w:after="0" w:line="240" w:lineRule="auto"/>
               <w:jc w:val="center"/>
               <w:cnfStyle w:val="100000000000" w:firstRow="1" w:lastRow="0" w:firstColumn="0" w:lastColumn="0" w:oddVBand="0" w:evenVBand="0" w:oddHBand="0" w:evenHBand="0" w:firstRowFirstColumn="0" w:firstRowLastColumn="0" w:lastRowFirstColumn="0" w:lastRowLastColumn="0"/>
               <w:rPr>
-                <w:rFonts w:ascii="Times New Roman" w:eastAsia="Times New Roman" w:hAnsi="Times New Roman" w:cs="Times New Roman"/>
-                <w:sz w:val="24"/>
-                <w:szCs w:val="24"/>
+                <w:rFonts w:asciiTheme="majorBidi" w:hAnsiTheme="majorBidi" w:cstheme="majorBidi"/>
+                <w:b w:val="0"/>
+                <w:bCs w:val="0"/>
+                <w:sz w:val="32"/>
+                <w:szCs w:val="32"/>
               </w:rPr>
             </w:pPr>
             <w:r>
               <w:rPr>
-                <w:rFonts w:ascii="Times New Roman" w:eastAsia="Times New Roman" w:hAnsi="Times New Roman" w:cs="Times New Roman"/>
-                <w:sz w:val="24"/>
-                <w:szCs w:val="24"/>
+                <w:rFonts w:asciiTheme="majorBidi" w:hAnsiTheme="majorBidi" w:cstheme="majorBidi"/>
+                <w:b w:val="0"/>
+                <w:bCs w:val="0"/>
+                <w:sz w:val="32"/>
+                <w:szCs w:val="32"/>
               </w:rPr>
               <w:t>Remarks</w:t>
             </w:r>
@@ -1613,25 +1636,27 @@
       <w:tr>
         <w:trPr>
           <w:cnfStyle w:val="000000100000" w:firstRow="0" w:lastRow="0" w:firstColumn="0" w:lastColumn="0" w:oddVBand="0" w:evenVBand="0" w:oddHBand="1" w:evenHBand="0" w:firstRowFirstColumn="0" w:firstRowLastColumn="0" w:lastRowFirstColumn="0" w:lastRowLastColumn="0"/>
+          <w:trHeight w:val="959"/>
         </w:trPr>
         <w:tc>
           <w:tcPr>
             <w:cnfStyle w:val="001000000000" w:firstRow="0" w:lastRow="0" w:firstColumn="1" w:lastColumn="0" w:oddVBand="0" w:evenVBand="0" w:oddHBand="0" w:evenHBand="0" w:firstRowFirstColumn="0" w:firstRowLastColumn="0" w:lastRowFirstColumn="0" w:lastRowLastColumn="0"/>
-            <w:tcW w:w="1016" w:type="dxa"/>
+            <w:tcW w:w="1336" w:type="dxa"/>
+            <w:vAlign w:val="center"/>
             <w:hideMark/>
           </w:tcPr>
           <w:p>
             <w:pPr>
-              <w:spacing w:after="0" w:line="240" w:lineRule="auto"/>
-              <w:rPr>
-                <w:rFonts w:ascii="Times New Roman" w:eastAsia="Times New Roman" w:hAnsi="Times New Roman" w:cs="Times New Roman"/>
+              <w:jc w:val="center"/>
+              <w:rPr>
+                <w:b w:val="0"/>
+                <w:bCs w:val="0"/>
                 <w:sz w:val="24"/>
                 <w:szCs w:val="24"/>
               </w:rPr>
             </w:pPr>
             <w:r>
               <w:rPr>
-                <w:rFonts w:ascii="Times New Roman" w:eastAsia="Times New Roman" w:hAnsi="Times New Roman" w:cs="Times New Roman"/>
                 <w:sz w:val="24"/>
                 <w:szCs w:val="24"/>
               </w:rPr>
@@ -1641,22 +1666,21 @@
         </w:tc>
         <w:tc>
           <w:tcPr>
-            <w:tcW w:w="1696" w:type="dxa"/>
+            <w:tcW w:w="1809" w:type="dxa"/>
+            <w:vAlign w:val="center"/>
             <w:hideMark/>
           </w:tcPr>
           <w:p>
             <w:pPr>
-              <w:spacing w:after="0" w:line="240" w:lineRule="auto"/>
+              <w:jc w:val="center"/>
               <w:cnfStyle w:val="000000100000" w:firstRow="0" w:lastRow="0" w:firstColumn="0" w:lastColumn="0" w:oddVBand="0" w:evenVBand="0" w:oddHBand="1" w:evenHBand="0" w:firstRowFirstColumn="0" w:firstRowLastColumn="0" w:lastRowFirstColumn="0" w:lastRowLastColumn="0"/>
               <w:rPr>
-                <w:rFonts w:ascii="Times New Roman" w:eastAsia="Times New Roman" w:hAnsi="Times New Roman" w:cs="Times New Roman"/>
                 <w:sz w:val="24"/>
                 <w:szCs w:val="24"/>
               </w:rPr>
             </w:pPr>
             <w:r>
               <w:rPr>
-                <w:rFonts w:ascii="Times New Roman" w:eastAsia="Times New Roman" w:hAnsi="Times New Roman" w:cs="Times New Roman"/>
                 <w:sz w:val="24"/>
                 <w:szCs w:val="24"/>
               </w:rPr>
@@ -1666,21 +1690,20 @@
         </w:tc>
         <w:tc>
           <w:tcPr>
-            <w:tcW w:w="4663" w:type="dxa"/>
+            <w:tcW w:w="4770" w:type="dxa"/>
+            <w:vAlign w:val="center"/>
+            <w:hideMark/>
           </w:tcPr>
           <w:p>
             <w:pPr>
-              <w:spacing w:after="0" w:line="240" w:lineRule="auto"/>
               <w:cnfStyle w:val="000000100000" w:firstRow="0" w:lastRow="0" w:firstColumn="0" w:lastColumn="0" w:oddVBand="0" w:evenVBand="0" w:oddHBand="1" w:evenHBand="0" w:firstRowFirstColumn="0" w:firstRowLastColumn="0" w:lastRowFirstColumn="0" w:lastRowLastColumn="0"/>
               <w:rPr>
-                <w:rFonts w:ascii="Times New Roman" w:eastAsia="Times New Roman" w:hAnsi="Times New Roman" w:cs="Times New Roman"/>
                 <w:sz w:val="24"/>
                 <w:szCs w:val="24"/>
               </w:rPr>
             </w:pPr>
             <w:r>
               <w:rPr>
-                <w:rFonts w:ascii="Times New Roman" w:eastAsia="Times New Roman" w:hAnsi="Times New Roman" w:cs="Times New Roman"/>
                 <w:sz w:val="24"/>
                 <w:szCs w:val="24"/>
               </w:rPr>
@@ -1689,7 +1712,6 @@
             <w:proofErr w:type="spellStart"/>
             <w:r>
               <w:rPr>
-                <w:rFonts w:ascii="Times New Roman" w:eastAsia="Times New Roman" w:hAnsi="Times New Roman" w:cs="Times New Roman"/>
                 <w:sz w:val="24"/>
                 <w:szCs w:val="24"/>
               </w:rPr>
@@ -1698,7 +1720,6 @@
             <w:proofErr w:type="spellEnd"/>
             <w:r>
               <w:rPr>
-                <w:rFonts w:ascii="Times New Roman" w:eastAsia="Times New Roman" w:hAnsi="Times New Roman" w:cs="Times New Roman"/>
                 <w:sz w:val="24"/>
                 <w:szCs w:val="24"/>
               </w:rPr>
@@ -1708,73 +1729,74 @@
         </w:tc>
         <w:tc>
           <w:tcPr>
-            <w:tcW w:w="1530" w:type="dxa"/>
+            <w:tcW w:w="1358" w:type="dxa"/>
+            <w:vAlign w:val="center"/>
             <w:hideMark/>
           </w:tcPr>
           <w:p>
             <w:pPr>
-              <w:spacing w:after="0" w:line="240" w:lineRule="auto"/>
+              <w:jc w:val="center"/>
               <w:cnfStyle w:val="000000100000" w:firstRow="0" w:lastRow="0" w:firstColumn="0" w:lastColumn="0" w:oddVBand="0" w:evenVBand="0" w:oddHBand="1" w:evenHBand="0" w:firstRowFirstColumn="0" w:firstRowLastColumn="0" w:lastRowFirstColumn="0" w:lastRowLastColumn="0"/>
               <w:rPr>
-                <w:rFonts w:ascii="Times New Roman" w:eastAsia="Times New Roman" w:hAnsi="Times New Roman" w:cs="Times New Roman"/>
                 <w:sz w:val="24"/>
                 <w:szCs w:val="24"/>
               </w:rPr>
             </w:pPr>
             <w:r>
               <w:rPr>
-                <w:rFonts w:ascii="Times New Roman" w:eastAsia="Times New Roman" w:hAnsi="Times New Roman" w:cs="Times New Roman"/>
-                <w:sz w:val="24"/>
-                <w:szCs w:val="24"/>
-              </w:rPr>
-              <w:t>14</w:t>
-            </w:r>
-            <w:r>
-              <w:rPr>
-                <w:rFonts w:ascii="Times New Roman" w:eastAsia="Times New Roman" w:hAnsi="Times New Roman" w:cs="Times New Roman"/>
-                <w:sz w:val="24"/>
-                <w:szCs w:val="24"/>
-              </w:rPr>
-              <w:t>-04-2026</w:t>
+                <w:sz w:val="24"/>
+                <w:szCs w:val="24"/>
+              </w:rPr>
+              <w:t>14-04-2026</w:t>
             </w:r>
           </w:p>
         </w:tc>
         <w:tc>
           <w:tcPr>
-            <w:tcW w:w="1885" w:type="dxa"/>
+            <w:tcW w:w="0" w:type="auto"/>
+            <w:vAlign w:val="center"/>
+            <w:hideMark/>
           </w:tcPr>
           <w:p>
             <w:pPr>
-              <w:spacing w:after="0" w:line="240" w:lineRule="auto"/>
+              <w:jc w:val="center"/>
               <w:cnfStyle w:val="000000100000" w:firstRow="0" w:lastRow="0" w:firstColumn="0" w:lastColumn="0" w:oddVBand="0" w:evenVBand="0" w:oddHBand="1" w:evenHBand="0" w:firstRowFirstColumn="0" w:firstRowLastColumn="0" w:lastRowFirstColumn="0" w:lastRowLastColumn="0"/>
               <w:rPr>
-                <w:rFonts w:ascii="Times New Roman" w:eastAsia="Times New Roman" w:hAnsi="Times New Roman" w:cs="Times New Roman"/>
                 <w:sz w:val="24"/>
                 <w:szCs w:val="24"/>
               </w:rPr>
             </w:pPr>
+            <w:r>
+              <w:rPr>
+                <w:sz w:val="24"/>
+                <w:szCs w:val="24"/>
+              </w:rPr>
+              <w:t>Initial setup</w:t>
+            </w:r>
           </w:p>
         </w:tc>
       </w:tr>
       <w:tr>
+        <w:trPr>
+          <w:trHeight w:val="1329"/>
+        </w:trPr>
         <w:tc>
           <w:tcPr>
             <w:cnfStyle w:val="001000000000" w:firstRow="0" w:lastRow="0" w:firstColumn="1" w:lastColumn="0" w:oddVBand="0" w:evenVBand="0" w:oddHBand="0" w:evenHBand="0" w:firstRowFirstColumn="0" w:firstRowLastColumn="0" w:lastRowFirstColumn="0" w:lastRowLastColumn="0"/>
-            <w:tcW w:w="1016" w:type="dxa"/>
+            <w:tcW w:w="1336" w:type="dxa"/>
+            <w:vAlign w:val="center"/>
             <w:hideMark/>
           </w:tcPr>
           <w:p>
             <w:pPr>
-              <w:spacing w:after="0" w:line="240" w:lineRule="auto"/>
-              <w:rPr>
-                <w:rFonts w:ascii="Times New Roman" w:eastAsia="Times New Roman" w:hAnsi="Times New Roman" w:cs="Times New Roman"/>
+              <w:jc w:val="center"/>
+              <w:rPr>
                 <w:sz w:val="24"/>
                 <w:szCs w:val="24"/>
               </w:rPr>
             </w:pPr>
             <w:r>
               <w:rPr>
-                <w:rFonts w:ascii="Times New Roman" w:eastAsia="Times New Roman" w:hAnsi="Times New Roman" w:cs="Times New Roman"/>
                 <w:sz w:val="24"/>
                 <w:szCs w:val="24"/>
               </w:rPr>
@@ -1784,79 +1806,52 @@
         </w:tc>
         <w:tc>
           <w:tcPr>
-            <w:tcW w:w="1696" w:type="dxa"/>
+            <w:tcW w:w="1809" w:type="dxa"/>
+            <w:vAlign w:val="center"/>
             <w:hideMark/>
           </w:tcPr>
           <w:p>
             <w:pPr>
-              <w:spacing w:after="0" w:line="240" w:lineRule="auto"/>
+              <w:jc w:val="center"/>
               <w:cnfStyle w:val="000000000000" w:firstRow="0" w:lastRow="0" w:firstColumn="0" w:lastColumn="0" w:oddVBand="0" w:evenVBand="0" w:oddHBand="0" w:evenHBand="0" w:firstRowFirstColumn="0" w:firstRowLastColumn="0" w:lastRowFirstColumn="0" w:lastRowLastColumn="0"/>
               <w:rPr>
-                <w:rFonts w:ascii="Times New Roman" w:eastAsia="Times New Roman" w:hAnsi="Times New Roman" w:cs="Times New Roman"/>
                 <w:sz w:val="24"/>
                 <w:szCs w:val="24"/>
               </w:rPr>
             </w:pPr>
             <w:r>
               <w:rPr>
-                <w:rFonts w:ascii="Times New Roman" w:eastAsia="Times New Roman" w:hAnsi="Times New Roman" w:cs="Times New Roman"/>
-                <w:sz w:val="24"/>
-                <w:szCs w:val="24"/>
-              </w:rPr>
-              <w:t>Database Design</w:t>
-            </w:r>
-            <w:r>
-              <w:rPr>
-                <w:rFonts w:ascii="Times New Roman" w:eastAsia="Times New Roman" w:hAnsi="Times New Roman" w:cs="Times New Roman"/>
-                <w:sz w:val="24"/>
-                <w:szCs w:val="24"/>
-              </w:rPr>
-              <w:t xml:space="preserve"> and ER Diagram</w:t>
+                <w:sz w:val="24"/>
+                <w:szCs w:val="24"/>
+              </w:rPr>
+              <w:t>Database Design and ER Diagram</w:t>
             </w:r>
           </w:p>
         </w:tc>
         <w:tc>
           <w:tcPr>
-            <w:tcW w:w="4663" w:type="dxa"/>
+            <w:tcW w:w="4770" w:type="dxa"/>
+            <w:vAlign w:val="center"/>
+            <w:hideMark/>
           </w:tcPr>
           <w:p>
             <w:pPr>
-              <w:spacing w:after="0" w:line="240" w:lineRule="auto"/>
               <w:cnfStyle w:val="000000000000" w:firstRow="0" w:lastRow="0" w:firstColumn="0" w:lastColumn="0" w:oddVBand="0" w:evenVBand="0" w:oddHBand="0" w:evenHBand="0" w:firstRowFirstColumn="0" w:firstRowLastColumn="0" w:lastRowFirstColumn="0" w:lastRowLastColumn="0"/>
               <w:rPr>
-                <w:rFonts w:ascii="Times New Roman" w:eastAsia="Times New Roman" w:hAnsi="Times New Roman" w:cs="Times New Roman"/>
                 <w:sz w:val="24"/>
                 <w:szCs w:val="24"/>
               </w:rPr>
             </w:pPr>
             <w:r>
               <w:rPr>
-                <w:rFonts w:ascii="Times New Roman" w:eastAsia="Times New Roman" w:hAnsi="Times New Roman" w:cs="Times New Roman"/>
-                <w:sz w:val="24"/>
-                <w:szCs w:val="24"/>
-              </w:rPr>
-              <w:t>Designed MySQL schema and created required tables</w:t>
-            </w:r>
-            <w:r>
-              <w:rPr>
-                <w:rFonts w:ascii="Times New Roman" w:eastAsia="Times New Roman" w:hAnsi="Times New Roman" w:cs="Times New Roman"/>
-                <w:sz w:val="24"/>
-                <w:szCs w:val="24"/>
-              </w:rPr>
-              <w:t xml:space="preserve">, </w:t>
-            </w:r>
-            <w:r>
-              <w:rPr>
-                <w:rFonts w:ascii="Times New Roman" w:eastAsia="Times New Roman" w:hAnsi="Times New Roman" w:cs="Times New Roman"/>
-                <w:sz w:val="24"/>
-                <w:szCs w:val="24"/>
-              </w:rPr>
-              <w:t xml:space="preserve">Created and added ER diagram using </w:t>
+                <w:sz w:val="24"/>
+                <w:szCs w:val="24"/>
+              </w:rPr>
+              <w:t xml:space="preserve">Designed MySQL schema and created required tables, created and added ER diagram using </w:t>
             </w:r>
             <w:proofErr w:type="spellStart"/>
             <w:r>
               <w:rPr>
-                <w:rFonts w:ascii="Times New Roman" w:eastAsia="Times New Roman" w:hAnsi="Times New Roman" w:cs="Times New Roman"/>
                 <w:sz w:val="24"/>
                 <w:szCs w:val="24"/>
               </w:rPr>
@@ -1867,471 +1862,440 @@
         </w:tc>
         <w:tc>
           <w:tcPr>
-            <w:tcW w:w="1530" w:type="dxa"/>
+            <w:tcW w:w="1358" w:type="dxa"/>
+            <w:vAlign w:val="center"/>
             <w:hideMark/>
           </w:tcPr>
           <w:p>
             <w:pPr>
-              <w:spacing w:after="0" w:line="240" w:lineRule="auto"/>
+              <w:jc w:val="center"/>
               <w:cnfStyle w:val="000000000000" w:firstRow="0" w:lastRow="0" w:firstColumn="0" w:lastColumn="0" w:oddVBand="0" w:evenVBand="0" w:oddHBand="0" w:evenHBand="0" w:firstRowFirstColumn="0" w:firstRowLastColumn="0" w:lastRowFirstColumn="0" w:lastRowLastColumn="0"/>
               <w:rPr>
-                <w:rFonts w:ascii="Times New Roman" w:eastAsia="Times New Roman" w:hAnsi="Times New Roman" w:cs="Times New Roman"/>
                 <w:sz w:val="24"/>
                 <w:szCs w:val="24"/>
               </w:rPr>
             </w:pPr>
             <w:r>
               <w:rPr>
-                <w:rFonts w:ascii="Times New Roman" w:eastAsia="Times New Roman" w:hAnsi="Times New Roman" w:cs="Times New Roman"/>
-                <w:sz w:val="24"/>
-                <w:szCs w:val="24"/>
-              </w:rPr>
-              <w:t>23</w:t>
-            </w:r>
-            <w:r>
-              <w:rPr>
-                <w:rFonts w:ascii="Times New Roman" w:eastAsia="Times New Roman" w:hAnsi="Times New Roman" w:cs="Times New Roman"/>
-                <w:sz w:val="24"/>
-                <w:szCs w:val="24"/>
-              </w:rPr>
-              <w:t>-04-2026</w:t>
+                <w:sz w:val="24"/>
+                <w:szCs w:val="24"/>
+              </w:rPr>
+              <w:t>23-04-2026</w:t>
             </w:r>
           </w:p>
         </w:tc>
         <w:tc>
           <w:tcPr>
-            <w:tcW w:w="1885" w:type="dxa"/>
+            <w:tcW w:w="0" w:type="auto"/>
+            <w:vAlign w:val="center"/>
+            <w:hideMark/>
           </w:tcPr>
           <w:p>
             <w:pPr>
-              <w:spacing w:after="0" w:line="240" w:lineRule="auto"/>
+              <w:jc w:val="center"/>
               <w:cnfStyle w:val="000000000000" w:firstRow="0" w:lastRow="0" w:firstColumn="0" w:lastColumn="0" w:oddVBand="0" w:evenVBand="0" w:oddHBand="0" w:evenHBand="0" w:firstRowFirstColumn="0" w:firstRowLastColumn="0" w:lastRowFirstColumn="0" w:lastRowLastColumn="0"/>
               <w:rPr>
-                <w:rFonts w:ascii="Times New Roman" w:eastAsia="Times New Roman" w:hAnsi="Times New Roman" w:cs="Times New Roman"/>
                 <w:sz w:val="24"/>
                 <w:szCs w:val="24"/>
               </w:rPr>
             </w:pPr>
+            <w:r>
+              <w:rPr>
+                <w:sz w:val="24"/>
+                <w:szCs w:val="24"/>
+              </w:rPr>
+              <w:t>ERD finalized</w:t>
+            </w:r>
           </w:p>
         </w:tc>
       </w:tr>
       <w:tr>
         <w:trPr>
           <w:cnfStyle w:val="000000100000" w:firstRow="0" w:lastRow="0" w:firstColumn="0" w:lastColumn="0" w:oddVBand="0" w:evenVBand="0" w:oddHBand="1" w:evenHBand="0" w:firstRowFirstColumn="0" w:firstRowLastColumn="0" w:lastRowFirstColumn="0" w:lastRowLastColumn="0"/>
+          <w:trHeight w:val="1310"/>
         </w:trPr>
         <w:tc>
           <w:tcPr>
             <w:cnfStyle w:val="001000000000" w:firstRow="0" w:lastRow="0" w:firstColumn="1" w:lastColumn="0" w:oddVBand="0" w:evenVBand="0" w:oddHBand="0" w:evenHBand="0" w:firstRowFirstColumn="0" w:firstRowLastColumn="0" w:lastRowFirstColumn="0" w:lastRowLastColumn="0"/>
-            <w:tcW w:w="1016" w:type="dxa"/>
+            <w:tcW w:w="1336" w:type="dxa"/>
+            <w:vAlign w:val="center"/>
+            <w:hideMark/>
           </w:tcPr>
           <w:p>
             <w:pPr>
-              <w:spacing w:after="0" w:line="240" w:lineRule="auto"/>
-              <w:rPr>
-                <w:rFonts w:ascii="Times New Roman" w:eastAsia="Times New Roman" w:hAnsi="Times New Roman" w:cs="Times New Roman"/>
+              <w:jc w:val="center"/>
+              <w:rPr>
                 <w:sz w:val="24"/>
                 <w:szCs w:val="24"/>
               </w:rPr>
             </w:pPr>
+            <w:r>
+              <w:rPr>
+                <w:sz w:val="24"/>
+                <w:szCs w:val="24"/>
+              </w:rPr>
+              <w:t>v1.2</w:t>
+            </w:r>
           </w:p>
         </w:tc>
         <w:tc>
           <w:tcPr>
-            <w:tcW w:w="1696" w:type="dxa"/>
+            <w:tcW w:w="1809" w:type="dxa"/>
+            <w:vAlign w:val="center"/>
+            <w:hideMark/>
           </w:tcPr>
           <w:p>
             <w:pPr>
-              <w:spacing w:after="0" w:line="240" w:lineRule="auto"/>
+              <w:jc w:val="center"/>
               <w:cnfStyle w:val="000000100000" w:firstRow="0" w:lastRow="0" w:firstColumn="0" w:lastColumn="0" w:oddVBand="0" w:evenVBand="0" w:oddHBand="1" w:evenHBand="0" w:firstRowFirstColumn="0" w:firstRowLastColumn="0" w:lastRowFirstColumn="0" w:lastRowLastColumn="0"/>
               <w:rPr>
-                <w:rFonts w:ascii="Times New Roman" w:eastAsia="Times New Roman" w:hAnsi="Times New Roman" w:cs="Times New Roman"/>
                 <w:sz w:val="24"/>
                 <w:szCs w:val="24"/>
               </w:rPr>
             </w:pPr>
+            <w:r>
+              <w:rPr>
+                <w:sz w:val="24"/>
+                <w:szCs w:val="24"/>
+              </w:rPr>
+              <w:t>Data Preprocessing</w:t>
+            </w:r>
           </w:p>
         </w:tc>
         <w:tc>
           <w:tcPr>
-            <w:tcW w:w="4663" w:type="dxa"/>
+            <w:tcW w:w="4770" w:type="dxa"/>
+            <w:vAlign w:val="center"/>
+            <w:hideMark/>
           </w:tcPr>
           <w:p>
             <w:pPr>
-              <w:spacing w:after="0" w:line="240" w:lineRule="auto"/>
               <w:cnfStyle w:val="000000100000" w:firstRow="0" w:lastRow="0" w:firstColumn="0" w:lastColumn="0" w:oddVBand="0" w:evenVBand="0" w:oddHBand="1" w:evenHBand="0" w:firstRowFirstColumn="0" w:firstRowLastColumn="0" w:lastRowFirstColumn="0" w:lastRowLastColumn="0"/>
               <w:rPr>
-                <w:rFonts w:ascii="Times New Roman" w:eastAsia="Times New Roman" w:hAnsi="Times New Roman" w:cs="Times New Roman"/>
                 <w:sz w:val="24"/>
                 <w:szCs w:val="24"/>
               </w:rPr>
             </w:pPr>
+            <w:r>
+              <w:rPr>
+                <w:sz w:val="24"/>
+                <w:szCs w:val="24"/>
+              </w:rPr>
+              <w:t>Cleaned dataset, handled missing values, created CSV files for tables, documented dataflow</w:t>
+            </w:r>
           </w:p>
         </w:tc>
         <w:tc>
           <w:tcPr>
-            <w:tcW w:w="1530" w:type="dxa"/>
+            <w:tcW w:w="1358" w:type="dxa"/>
+            <w:vAlign w:val="center"/>
+            <w:hideMark/>
           </w:tcPr>
           <w:p>
             <w:pPr>
-              <w:spacing w:after="0" w:line="240" w:lineRule="auto"/>
+              <w:jc w:val="center"/>
               <w:cnfStyle w:val="000000100000" w:firstRow="0" w:lastRow="0" w:firstColumn="0" w:lastColumn="0" w:oddVBand="0" w:evenVBand="0" w:oddHBand="1" w:evenHBand="0" w:firstRowFirstColumn="0" w:firstRowLastColumn="0" w:lastRowFirstColumn="0" w:lastRowLastColumn="0"/>
               <w:rPr>
-                <w:rFonts w:ascii="Times New Roman" w:eastAsia="Times New Roman" w:hAnsi="Times New Roman" w:cs="Times New Roman"/>
                 <w:sz w:val="24"/>
                 <w:szCs w:val="24"/>
               </w:rPr>
             </w:pPr>
+            <w:r>
+              <w:rPr>
+                <w:sz w:val="24"/>
+                <w:szCs w:val="24"/>
+              </w:rPr>
+              <w:t>06</w:t>
+            </w:r>
+            <w:r>
+              <w:rPr>
+                <w:sz w:val="24"/>
+                <w:szCs w:val="24"/>
+              </w:rPr>
+              <w:t>-05-2026</w:t>
+            </w:r>
           </w:p>
         </w:tc>
         <w:tc>
           <w:tcPr>
-            <w:tcW w:w="1885" w:type="dxa"/>
+            <w:tcW w:w="0" w:type="auto"/>
+            <w:vAlign w:val="center"/>
+            <w:hideMark/>
           </w:tcPr>
           <w:p>
             <w:pPr>
-              <w:spacing w:after="0" w:line="240" w:lineRule="auto"/>
+              <w:jc w:val="center"/>
               <w:cnfStyle w:val="000000100000" w:firstRow="0" w:lastRow="0" w:firstColumn="0" w:lastColumn="0" w:oddVBand="0" w:evenVBand="0" w:oddHBand="1" w:evenHBand="0" w:firstRowFirstColumn="0" w:firstRowLastColumn="0" w:lastRowFirstColumn="0" w:lastRowLastColumn="0"/>
               <w:rPr>
-                <w:rFonts w:ascii="Times New Roman" w:eastAsia="Times New Roman" w:hAnsi="Times New Roman" w:cs="Times New Roman"/>
                 <w:sz w:val="24"/>
                 <w:szCs w:val="24"/>
               </w:rPr>
             </w:pPr>
+            <w:r>
+              <w:rPr>
+                <w:sz w:val="24"/>
+                <w:szCs w:val="24"/>
+              </w:rPr>
+              <w:t>M3 completed</w:t>
+            </w:r>
           </w:p>
         </w:tc>
       </w:tr>
       <w:tr>
+        <w:trPr>
+          <w:trHeight w:val="959"/>
+        </w:trPr>
         <w:tc>
           <w:tcPr>
             <w:cnfStyle w:val="001000000000" w:firstRow="0" w:lastRow="0" w:firstColumn="1" w:lastColumn="0" w:oddVBand="0" w:evenVBand="0" w:oddHBand="0" w:evenHBand="0" w:firstRowFirstColumn="0" w:firstRowLastColumn="0" w:lastRowFirstColumn="0" w:lastRowLastColumn="0"/>
-            <w:tcW w:w="1016" w:type="dxa"/>
+            <w:tcW w:w="1336" w:type="dxa"/>
+            <w:vAlign w:val="center"/>
+            <w:hideMark/>
           </w:tcPr>
           <w:p>
             <w:pPr>
-              <w:spacing w:after="0" w:line="240" w:lineRule="auto"/>
-              <w:rPr>
-                <w:rFonts w:ascii="Times New Roman" w:eastAsia="Times New Roman" w:hAnsi="Times New Roman" w:cs="Times New Roman"/>
+              <w:jc w:val="center"/>
+              <w:rPr>
                 <w:sz w:val="24"/>
                 <w:szCs w:val="24"/>
               </w:rPr>
             </w:pPr>
+            <w:r>
+              <w:rPr>
+                <w:sz w:val="24"/>
+                <w:szCs w:val="24"/>
+              </w:rPr>
+              <w:t>v1.3</w:t>
+            </w:r>
           </w:p>
         </w:tc>
         <w:tc>
           <w:tcPr>
-            <w:tcW w:w="1696" w:type="dxa"/>
+            <w:tcW w:w="1809" w:type="dxa"/>
+            <w:vAlign w:val="center"/>
+            <w:hideMark/>
           </w:tcPr>
           <w:p>
             <w:pPr>
-              <w:spacing w:after="0" w:line="240" w:lineRule="auto"/>
+              <w:jc w:val="center"/>
               <w:cnfStyle w:val="000000000000" w:firstRow="0" w:lastRow="0" w:firstColumn="0" w:lastColumn="0" w:oddVBand="0" w:evenVBand="0" w:oddHBand="0" w:evenHBand="0" w:firstRowFirstColumn="0" w:firstRowLastColumn="0" w:lastRowFirstColumn="0" w:lastRowLastColumn="0"/>
               <w:rPr>
-                <w:rFonts w:ascii="Times New Roman" w:eastAsia="Times New Roman" w:hAnsi="Times New Roman" w:cs="Times New Roman"/>
                 <w:sz w:val="24"/>
                 <w:szCs w:val="24"/>
               </w:rPr>
             </w:pPr>
+            <w:r>
+              <w:rPr>
+                <w:sz w:val="24"/>
+                <w:szCs w:val="24"/>
+              </w:rPr>
+              <w:t>Database Setup (DDL)</w:t>
+            </w:r>
           </w:p>
         </w:tc>
         <w:tc>
           <w:tcPr>
-            <w:tcW w:w="4663" w:type="dxa"/>
+            <w:tcW w:w="4770" w:type="dxa"/>
+            <w:vAlign w:val="center"/>
+            <w:hideMark/>
           </w:tcPr>
           <w:p>
             <w:pPr>
-              <w:spacing w:after="0" w:line="240" w:lineRule="auto"/>
               <w:cnfStyle w:val="000000000000" w:firstRow="0" w:lastRow="0" w:firstColumn="0" w:lastColumn="0" w:oddVBand="0" w:evenVBand="0" w:oddHBand="0" w:evenHBand="0" w:firstRowFirstColumn="0" w:firstRowLastColumn="0" w:lastRowFirstColumn="0" w:lastRowLastColumn="0"/>
               <w:rPr>
-                <w:rFonts w:ascii="Times New Roman" w:eastAsia="Times New Roman" w:hAnsi="Times New Roman" w:cs="Times New Roman"/>
                 <w:sz w:val="24"/>
                 <w:szCs w:val="24"/>
               </w:rPr>
             </w:pPr>
+            <w:r>
+              <w:rPr>
+                <w:sz w:val="24"/>
+                <w:szCs w:val="24"/>
+              </w:rPr>
+              <w:t>Created all tables with PK, FK, constraints and indexes, verified schema in MySQL Workbench</w:t>
+            </w:r>
           </w:p>
         </w:tc>
         <w:tc>
           <w:tcPr>
-            <w:tcW w:w="1530" w:type="dxa"/>
+            <w:tcW w:w="1358" w:type="dxa"/>
+            <w:vAlign w:val="center"/>
+            <w:hideMark/>
           </w:tcPr>
           <w:p>
             <w:pPr>
-              <w:spacing w:after="0" w:line="240" w:lineRule="auto"/>
+              <w:jc w:val="center"/>
               <w:cnfStyle w:val="000000000000" w:firstRow="0" w:lastRow="0" w:firstColumn="0" w:lastColumn="0" w:oddVBand="0" w:evenVBand="0" w:oddHBand="0" w:evenHBand="0" w:firstRowFirstColumn="0" w:firstRowLastColumn="0" w:lastRowFirstColumn="0" w:lastRowLastColumn="0"/>
               <w:rPr>
-                <w:rFonts w:ascii="Times New Roman" w:eastAsia="Times New Roman" w:hAnsi="Times New Roman" w:cs="Times New Roman"/>
                 <w:sz w:val="24"/>
                 <w:szCs w:val="24"/>
               </w:rPr>
             </w:pPr>
+            <w:r>
+              <w:rPr>
+                <w:sz w:val="24"/>
+                <w:szCs w:val="24"/>
+              </w:rPr>
+              <w:t>16</w:t>
+            </w:r>
+            <w:bookmarkStart w:id="0" w:name="_GoBack"/>
+            <w:bookmarkEnd w:id="0"/>
+            <w:r>
+              <w:rPr>
+                <w:sz w:val="24"/>
+                <w:szCs w:val="24"/>
+              </w:rPr>
+              <w:t>-05-2026</w:t>
+            </w:r>
           </w:p>
         </w:tc>
         <w:tc>
           <w:tcPr>
-            <w:tcW w:w="1885" w:type="dxa"/>
+            <w:tcW w:w="0" w:type="auto"/>
+            <w:vAlign w:val="center"/>
+            <w:hideMark/>
           </w:tcPr>
           <w:p>
             <w:pPr>
-              <w:spacing w:after="0" w:line="240" w:lineRule="auto"/>
+              <w:jc w:val="center"/>
               <w:cnfStyle w:val="000000000000" w:firstRow="0" w:lastRow="0" w:firstColumn="0" w:lastColumn="0" w:oddVBand="0" w:evenVBand="0" w:oddHBand="0" w:evenHBand="0" w:firstRowFirstColumn="0" w:firstRowLastColumn="0" w:lastRowFirstColumn="0" w:lastRowLastColumn="0"/>
               <w:rPr>
-                <w:rFonts w:ascii="Times New Roman" w:eastAsia="Times New Roman" w:hAnsi="Times New Roman" w:cs="Times New Roman"/>
                 <w:sz w:val="24"/>
                 <w:szCs w:val="24"/>
               </w:rPr>
             </w:pPr>
+            <w:r>
+              <w:rPr>
+                <w:sz w:val="24"/>
+                <w:szCs w:val="24"/>
+              </w:rPr>
+              <w:t>M4 completed</w:t>
+            </w:r>
           </w:p>
         </w:tc>
       </w:tr>
       <w:tr>
         <w:trPr>
           <w:cnfStyle w:val="000000100000" w:firstRow="0" w:lastRow="0" w:firstColumn="0" w:lastColumn="0" w:oddVBand="0" w:evenVBand="0" w:oddHBand="1" w:evenHBand="0" w:firstRowFirstColumn="0" w:firstRowLastColumn="0" w:lastRowFirstColumn="0" w:lastRowLastColumn="0"/>
+          <w:trHeight w:val="1329"/>
         </w:trPr>
         <w:tc>
           <w:tcPr>
             <w:cnfStyle w:val="001000000000" w:firstRow="0" w:lastRow="0" w:firstColumn="1" w:lastColumn="0" w:oddVBand="0" w:evenVBand="0" w:oddHBand="0" w:evenHBand="0" w:firstRowFirstColumn="0" w:firstRowLastColumn="0" w:lastRowFirstColumn="0" w:lastRowLastColumn="0"/>
-            <w:tcW w:w="1016" w:type="dxa"/>
+            <w:tcW w:w="1336" w:type="dxa"/>
+            <w:vAlign w:val="center"/>
+            <w:hideMark/>
           </w:tcPr>
           <w:p>
             <w:pPr>
-              <w:spacing w:after="0" w:line="240" w:lineRule="auto"/>
-              <w:rPr>
-                <w:rFonts w:ascii="Times New Roman" w:eastAsia="Times New Roman" w:hAnsi="Times New Roman" w:cs="Times New Roman"/>
+              <w:jc w:val="center"/>
+              <w:rPr>
                 <w:sz w:val="24"/>
                 <w:szCs w:val="24"/>
               </w:rPr>
             </w:pPr>
+            <w:r>
+              <w:rPr>
+                <w:sz w:val="24"/>
+                <w:szCs w:val="24"/>
+              </w:rPr>
+              <w:t>v1.4</w:t>
+            </w:r>
           </w:p>
         </w:tc>
         <w:tc>
           <w:tcPr>
-            <w:tcW w:w="1696" w:type="dxa"/>
+            <w:tcW w:w="1809" w:type="dxa"/>
+            <w:vAlign w:val="center"/>
+            <w:hideMark/>
           </w:tcPr>
           <w:p>
             <w:pPr>
-              <w:spacing w:after="0" w:line="240" w:lineRule="auto"/>
+              <w:jc w:val="center"/>
               <w:cnfStyle w:val="000000100000" w:firstRow="0" w:lastRow="0" w:firstColumn="0" w:lastColumn="0" w:oddVBand="0" w:evenVBand="0" w:oddHBand="1" w:evenHBand="0" w:firstRowFirstColumn="0" w:firstRowLastColumn="0" w:lastRowFirstColumn="0" w:lastRowLastColumn="0"/>
               <w:rPr>
-                <w:rFonts w:ascii="Times New Roman" w:eastAsia="Times New Roman" w:hAnsi="Times New Roman" w:cs="Times New Roman"/>
                 <w:sz w:val="24"/>
                 <w:szCs w:val="24"/>
               </w:rPr>
             </w:pPr>
+            <w:r>
+              <w:rPr>
+                <w:sz w:val="24"/>
+                <w:szCs w:val="24"/>
+              </w:rPr>
+              <w:t>Data Population &amp; Validation</w:t>
+            </w:r>
           </w:p>
         </w:tc>
         <w:tc>
           <w:tcPr>
-            <w:tcW w:w="4663" w:type="dxa"/>
+            <w:tcW w:w="4770" w:type="dxa"/>
+            <w:vAlign w:val="center"/>
+            <w:hideMark/>
           </w:tcPr>
           <w:p>
             <w:pPr>
-              <w:spacing w:after="0" w:line="240" w:lineRule="auto"/>
               <w:cnfStyle w:val="000000100000" w:firstRow="0" w:lastRow="0" w:firstColumn="0" w:lastColumn="0" w:oddVBand="0" w:evenVBand="0" w:oddHBand="1" w:evenHBand="0" w:firstRowFirstColumn="0" w:firstRowLastColumn="0" w:lastRowFirstColumn="0" w:lastRowLastColumn="0"/>
               <w:rPr>
-                <w:rFonts w:ascii="Times New Roman" w:eastAsia="Times New Roman" w:hAnsi="Times New Roman" w:cs="Times New Roman"/>
                 <w:sz w:val="24"/>
                 <w:szCs w:val="24"/>
               </w:rPr>
             </w:pPr>
+            <w:r>
+              <w:rPr>
+                <w:sz w:val="24"/>
+                <w:szCs w:val="24"/>
+              </w:rPr>
+              <w:t>Loaded data using LOAD DATA INFILE and INSERT, performed UPDATE/DELETE operations, added validation queries</w:t>
+            </w:r>
           </w:p>
         </w:tc>
         <w:tc>
           <w:tcPr>
-            <w:tcW w:w="1530" w:type="dxa"/>
+            <w:tcW w:w="1358" w:type="dxa"/>
+            <w:vAlign w:val="center"/>
+            <w:hideMark/>
           </w:tcPr>
           <w:p>
             <w:pPr>
-              <w:spacing w:after="0" w:line="240" w:lineRule="auto"/>
+              <w:jc w:val="center"/>
               <w:cnfStyle w:val="000000100000" w:firstRow="0" w:lastRow="0" w:firstColumn="0" w:lastColumn="0" w:oddVBand="0" w:evenVBand="0" w:oddHBand="1" w:evenHBand="0" w:firstRowFirstColumn="0" w:firstRowLastColumn="0" w:lastRowFirstColumn="0" w:lastRowLastColumn="0"/>
               <w:rPr>
-                <w:rFonts w:ascii="Times New Roman" w:eastAsia="Times New Roman" w:hAnsi="Times New Roman" w:cs="Times New Roman"/>
                 <w:sz w:val="24"/>
                 <w:szCs w:val="24"/>
               </w:rPr>
             </w:pPr>
+            <w:r>
+              <w:rPr>
+                <w:sz w:val="24"/>
+                <w:szCs w:val="24"/>
+              </w:rPr>
+              <w:t>17-05-2026</w:t>
+            </w:r>
           </w:p>
         </w:tc>
         <w:tc>
           <w:tcPr>
-            <w:tcW w:w="1885" w:type="dxa"/>
+            <w:tcW w:w="0" w:type="auto"/>
+            <w:vAlign w:val="center"/>
+            <w:hideMark/>
           </w:tcPr>
           <w:p>
             <w:pPr>
-              <w:spacing w:after="0" w:line="240" w:lineRule="auto"/>
+              <w:jc w:val="center"/>
               <w:cnfStyle w:val="000000100000" w:firstRow="0" w:lastRow="0" w:firstColumn="0" w:lastColumn="0" w:oddVBand="0" w:evenVBand="0" w:oddHBand="1" w:evenHBand="0" w:firstRowFirstColumn="0" w:firstRowLastColumn="0" w:lastRowFirstColumn="0" w:lastRowLastColumn="0"/>
               <w:rPr>
-                <w:rFonts w:ascii="Times New Roman" w:eastAsia="Times New Roman" w:hAnsi="Times New Roman" w:cs="Times New Roman"/>
                 <w:sz w:val="24"/>
                 <w:szCs w:val="24"/>
               </w:rPr>
             </w:pPr>
-          </w:p>
-        </w:tc>
-      </w:tr>
-      <w:tr>
-        <w:tc>
-          <w:tcPr>
-            <w:cnfStyle w:val="001000000000" w:firstRow="0" w:lastRow="0" w:firstColumn="1" w:lastColumn="0" w:oddVBand="0" w:evenVBand="0" w:oddHBand="0" w:evenHBand="0" w:firstRowFirstColumn="0" w:firstRowLastColumn="0" w:lastRowFirstColumn="0" w:lastRowLastColumn="0"/>
-            <w:tcW w:w="1016" w:type="dxa"/>
-          </w:tcPr>
-          <w:p>
-            <w:pPr>
-              <w:spacing w:after="0" w:line="240" w:lineRule="auto"/>
-              <w:rPr>
-                <w:rFonts w:ascii="Times New Roman" w:eastAsia="Times New Roman" w:hAnsi="Times New Roman" w:cs="Times New Roman"/>
-                <w:sz w:val="24"/>
-                <w:szCs w:val="24"/>
-              </w:rPr>
-            </w:pPr>
-          </w:p>
-        </w:tc>
-        <w:tc>
-          <w:tcPr>
-            <w:tcW w:w="1696" w:type="dxa"/>
-          </w:tcPr>
-          <w:p>
-            <w:pPr>
-              <w:spacing w:after="0" w:line="240" w:lineRule="auto"/>
-              <w:cnfStyle w:val="000000000000" w:firstRow="0" w:lastRow="0" w:firstColumn="0" w:lastColumn="0" w:oddVBand="0" w:evenVBand="0" w:oddHBand="0" w:evenHBand="0" w:firstRowFirstColumn="0" w:firstRowLastColumn="0" w:lastRowFirstColumn="0" w:lastRowLastColumn="0"/>
-              <w:rPr>
-                <w:rFonts w:ascii="Times New Roman" w:eastAsia="Times New Roman" w:hAnsi="Times New Roman" w:cs="Times New Roman"/>
-                <w:sz w:val="24"/>
-                <w:szCs w:val="24"/>
-              </w:rPr>
-            </w:pPr>
-          </w:p>
-        </w:tc>
-        <w:tc>
-          <w:tcPr>
-            <w:tcW w:w="4663" w:type="dxa"/>
-          </w:tcPr>
-          <w:p>
-            <w:pPr>
-              <w:spacing w:after="0" w:line="240" w:lineRule="auto"/>
-              <w:cnfStyle w:val="000000000000" w:firstRow="0" w:lastRow="0" w:firstColumn="0" w:lastColumn="0" w:oddVBand="0" w:evenVBand="0" w:oddHBand="0" w:evenHBand="0" w:firstRowFirstColumn="0" w:firstRowLastColumn="0" w:lastRowFirstColumn="0" w:lastRowLastColumn="0"/>
-              <w:rPr>
-                <w:rFonts w:ascii="Times New Roman" w:eastAsia="Times New Roman" w:hAnsi="Times New Roman" w:cs="Times New Roman"/>
-                <w:sz w:val="24"/>
-                <w:szCs w:val="24"/>
-              </w:rPr>
-            </w:pPr>
-          </w:p>
-        </w:tc>
-        <w:tc>
-          <w:tcPr>
-            <w:tcW w:w="1530" w:type="dxa"/>
-          </w:tcPr>
-          <w:p>
-            <w:pPr>
-              <w:spacing w:after="0" w:line="240" w:lineRule="auto"/>
-              <w:cnfStyle w:val="000000000000" w:firstRow="0" w:lastRow="0" w:firstColumn="0" w:lastColumn="0" w:oddVBand="0" w:evenVBand="0" w:oddHBand="0" w:evenHBand="0" w:firstRowFirstColumn="0" w:firstRowLastColumn="0" w:lastRowFirstColumn="0" w:lastRowLastColumn="0"/>
-              <w:rPr>
-                <w:rFonts w:ascii="Times New Roman" w:eastAsia="Times New Roman" w:hAnsi="Times New Roman" w:cs="Times New Roman"/>
-                <w:sz w:val="24"/>
-                <w:szCs w:val="24"/>
-              </w:rPr>
-            </w:pPr>
-          </w:p>
-        </w:tc>
-        <w:tc>
-          <w:tcPr>
-            <w:tcW w:w="1885" w:type="dxa"/>
-          </w:tcPr>
-          <w:p>
-            <w:pPr>
-              <w:spacing w:after="0" w:line="240" w:lineRule="auto"/>
-              <w:cnfStyle w:val="000000000000" w:firstRow="0" w:lastRow="0" w:firstColumn="0" w:lastColumn="0" w:oddVBand="0" w:evenVBand="0" w:oddHBand="0" w:evenHBand="0" w:firstRowFirstColumn="0" w:firstRowLastColumn="0" w:lastRowFirstColumn="0" w:lastRowLastColumn="0"/>
-              <w:rPr>
-                <w:rFonts w:ascii="Times New Roman" w:eastAsia="Times New Roman" w:hAnsi="Times New Roman" w:cs="Times New Roman"/>
-                <w:sz w:val="24"/>
-                <w:szCs w:val="24"/>
-              </w:rPr>
-            </w:pPr>
-          </w:p>
-        </w:tc>
-      </w:tr>
-      <w:tr>
-        <w:trPr>
-          <w:cnfStyle w:val="000000100000" w:firstRow="0" w:lastRow="0" w:firstColumn="0" w:lastColumn="0" w:oddVBand="0" w:evenVBand="0" w:oddHBand="1" w:evenHBand="0" w:firstRowFirstColumn="0" w:firstRowLastColumn="0" w:lastRowFirstColumn="0" w:lastRowLastColumn="0"/>
-          <w:trHeight w:val="332"/>
-        </w:trPr>
-        <w:tc>
-          <w:tcPr>
-            <w:cnfStyle w:val="001000000000" w:firstRow="0" w:lastRow="0" w:firstColumn="1" w:lastColumn="0" w:oddVBand="0" w:evenVBand="0" w:oddHBand="0" w:evenHBand="0" w:firstRowFirstColumn="0" w:firstRowLastColumn="0" w:lastRowFirstColumn="0" w:lastRowLastColumn="0"/>
-            <w:tcW w:w="1016" w:type="dxa"/>
-          </w:tcPr>
-          <w:p>
-            <w:pPr>
-              <w:spacing w:after="0" w:line="240" w:lineRule="auto"/>
-              <w:rPr>
-                <w:rFonts w:ascii="Times New Roman" w:eastAsia="Times New Roman" w:hAnsi="Times New Roman" w:cs="Times New Roman"/>
-                <w:sz w:val="24"/>
-                <w:szCs w:val="24"/>
-              </w:rPr>
-            </w:pPr>
-          </w:p>
-        </w:tc>
-        <w:tc>
-          <w:tcPr>
-            <w:tcW w:w="1696" w:type="dxa"/>
-          </w:tcPr>
-          <w:p>
-            <w:pPr>
-              <w:spacing w:after="0" w:line="240" w:lineRule="auto"/>
-              <w:cnfStyle w:val="000000100000" w:firstRow="0" w:lastRow="0" w:firstColumn="0" w:lastColumn="0" w:oddVBand="0" w:evenVBand="0" w:oddHBand="1" w:evenHBand="0" w:firstRowFirstColumn="0" w:firstRowLastColumn="0" w:lastRowFirstColumn="0" w:lastRowLastColumn="0"/>
-              <w:rPr>
-                <w:rFonts w:ascii="Times New Roman" w:eastAsia="Times New Roman" w:hAnsi="Times New Roman" w:cs="Times New Roman"/>
-                <w:sz w:val="24"/>
-                <w:szCs w:val="24"/>
-              </w:rPr>
-            </w:pPr>
-          </w:p>
-        </w:tc>
-        <w:tc>
-          <w:tcPr>
-            <w:tcW w:w="4663" w:type="dxa"/>
-          </w:tcPr>
-          <w:p>
-            <w:pPr>
-              <w:spacing w:after="0" w:line="240" w:lineRule="auto"/>
-              <w:cnfStyle w:val="000000100000" w:firstRow="0" w:lastRow="0" w:firstColumn="0" w:lastColumn="0" w:oddVBand="0" w:evenVBand="0" w:oddHBand="1" w:evenHBand="0" w:firstRowFirstColumn="0" w:firstRowLastColumn="0" w:lastRowFirstColumn="0" w:lastRowLastColumn="0"/>
-              <w:rPr>
-                <w:rFonts w:ascii="Times New Roman" w:eastAsia="Times New Roman" w:hAnsi="Times New Roman" w:cs="Times New Roman"/>
-                <w:sz w:val="24"/>
-                <w:szCs w:val="24"/>
-              </w:rPr>
-            </w:pPr>
-          </w:p>
-        </w:tc>
-        <w:tc>
-          <w:tcPr>
-            <w:tcW w:w="1530" w:type="dxa"/>
-          </w:tcPr>
-          <w:p>
-            <w:pPr>
-              <w:spacing w:after="0" w:line="240" w:lineRule="auto"/>
-              <w:cnfStyle w:val="000000100000" w:firstRow="0" w:lastRow="0" w:firstColumn="0" w:lastColumn="0" w:oddVBand="0" w:evenVBand="0" w:oddHBand="1" w:evenHBand="0" w:firstRowFirstColumn="0" w:firstRowLastColumn="0" w:lastRowFirstColumn="0" w:lastRowLastColumn="0"/>
-              <w:rPr>
-                <w:rFonts w:ascii="Times New Roman" w:eastAsia="Times New Roman" w:hAnsi="Times New Roman" w:cs="Times New Roman"/>
-                <w:sz w:val="24"/>
-                <w:szCs w:val="24"/>
-              </w:rPr>
-            </w:pPr>
-          </w:p>
-        </w:tc>
-        <w:tc>
-          <w:tcPr>
-            <w:tcW w:w="1885" w:type="dxa"/>
-          </w:tcPr>
-          <w:p>
-            <w:pPr>
-              <w:spacing w:after="0" w:line="240" w:lineRule="auto"/>
-              <w:cnfStyle w:val="000000100000" w:firstRow="0" w:lastRow="0" w:firstColumn="0" w:lastColumn="0" w:oddVBand="0" w:evenVBand="0" w:oddHBand="1" w:evenHBand="0" w:firstRowFirstColumn="0" w:firstRowLastColumn="0" w:lastRowFirstColumn="0" w:lastRowLastColumn="0"/>
-              <w:rPr>
-                <w:rFonts w:ascii="Times New Roman" w:eastAsia="Times New Roman" w:hAnsi="Times New Roman" w:cs="Times New Roman"/>
-                <w:sz w:val="24"/>
-                <w:szCs w:val="24"/>
-              </w:rPr>
-            </w:pPr>
+            <w:r>
+              <w:rPr>
+                <w:sz w:val="24"/>
+                <w:szCs w:val="24"/>
+              </w:rPr>
+              <w:t>M5 completed</w:t>
+            </w:r>
           </w:p>
         </w:tc>
       </w:tr>
@@ -3392,6 +3356,82 @@
       </w:tcPr>
     </w:tblStylePr>
   </w:style>
+  <w:style w:type="table" w:styleId="GridTable4-Accent1">
+    <w:name w:val="Grid Table 4 Accent 1"/>
+    <w:basedOn w:val="TableNormal"/>
+    <w:uiPriority w:val="49"/>
+    <w:rsid w:val="00426641"/>
+    <w:pPr>
+      <w:spacing w:after="0" w:line="240" w:lineRule="auto"/>
+    </w:pPr>
+    <w:tblPr>
+      <w:tblStyleRowBandSize w:val="1"/>
+      <w:tblStyleColBandSize w:val="1"/>
+      <w:tblBorders>
+        <w:top w:val="single" w:sz="4" w:space="0" w:color="9CC2E5" w:themeColor="accent1" w:themeTint="99"/>
+        <w:left w:val="single" w:sz="4" w:space="0" w:color="9CC2E5" w:themeColor="accent1" w:themeTint="99"/>
+        <w:bottom w:val="single" w:sz="4" w:space="0" w:color="9CC2E5" w:themeColor="accent1" w:themeTint="99"/>
+        <w:right w:val="single" w:sz="4" w:space="0" w:color="9CC2E5" w:themeColor="accent1" w:themeTint="99"/>
+        <w:insideH w:val="single" w:sz="4" w:space="0" w:color="9CC2E5" w:themeColor="accent1" w:themeTint="99"/>
+        <w:insideV w:val="single" w:sz="4" w:space="0" w:color="9CC2E5" w:themeColor="accent1" w:themeTint="99"/>
+      </w:tblBorders>
+    </w:tblPr>
+    <w:tblStylePr w:type="firstRow">
+      <w:rPr>
+        <w:b/>
+        <w:bCs/>
+        <w:color w:val="FFFFFF" w:themeColor="background1"/>
+      </w:rPr>
+      <w:tblPr/>
+      <w:tcPr>
+        <w:tcBorders>
+          <w:top w:val="single" w:sz="4" w:space="0" w:color="5B9BD5" w:themeColor="accent1"/>
+          <w:left w:val="single" w:sz="4" w:space="0" w:color="5B9BD5" w:themeColor="accent1"/>
+          <w:bottom w:val="single" w:sz="4" w:space="0" w:color="5B9BD5" w:themeColor="accent1"/>
+          <w:right w:val="single" w:sz="4" w:space="0" w:color="5B9BD5" w:themeColor="accent1"/>
+          <w:insideH w:val="nil"/>
+          <w:insideV w:val="nil"/>
+        </w:tcBorders>
+        <w:shd w:val="clear" w:color="auto" w:fill="5B9BD5" w:themeFill="accent1"/>
+      </w:tcPr>
+    </w:tblStylePr>
+    <w:tblStylePr w:type="lastRow">
+      <w:rPr>
+        <w:b/>
+        <w:bCs/>
+      </w:rPr>
+      <w:tblPr/>
+      <w:tcPr>
+        <w:tcBorders>
+          <w:top w:val="double" w:sz="4" w:space="0" w:color="5B9BD5" w:themeColor="accent1"/>
+        </w:tcBorders>
+      </w:tcPr>
+    </w:tblStylePr>
+    <w:tblStylePr w:type="firstCol">
+      <w:rPr>
+        <w:b/>
+        <w:bCs/>
+      </w:rPr>
+    </w:tblStylePr>
+    <w:tblStylePr w:type="lastCol">
+      <w:rPr>
+        <w:b/>
+        <w:bCs/>
+      </w:rPr>
+    </w:tblStylePr>
+    <w:tblStylePr w:type="band1Vert">
+      <w:tblPr/>
+      <w:tcPr>
+        <w:shd w:val="clear" w:color="auto" w:fill="DEEAF6" w:themeFill="accent1" w:themeFillTint="33"/>
+      </w:tcPr>
+    </w:tblStylePr>
+    <w:tblStylePr w:type="band1Horz">
+      <w:tblPr/>
+      <w:tcPr>
+        <w:shd w:val="clear" w:color="auto" w:fill="DEEAF6" w:themeFill="accent1" w:themeFillTint="33"/>
+      </w:tcPr>
+    </w:tblStylePr>
+  </w:style>
 </w:styles>
 </file>
 

</xml_diff>